<commit_message>
docs: mise a jour complete du rapport Word
</commit_message>
<xml_diff>
--- a/RAPPORT_JUMEAU_NUMERIQUE_ENSIIE.docx
+++ b/RAPPORT_JUMEAU_NUMERIQUE_ENSIIE.docx
@@ -4,13 +4,13 @@
   <w:body>
     <w:p>
       <w:pPr>
-        <w:spacing w:after="240"/>
+        <w:spacing w:after="200"/>
         <w:jc w:val="center"/>
       </w:pPr>
       <w:r>
         <w:drawing>
           <wp:inline xmlns:a="http://schemas.openxmlformats.org/drawingml/2006/main" xmlns:pic="http://schemas.openxmlformats.org/drawingml/2006/picture">
-            <wp:extent cx="2560320" cy="1177647"/>
+            <wp:extent cx="2286000" cy="1051471"/>
             <wp:docPr id="1" name="Picture 1"/>
             <wp:cNvGraphicFramePr>
               <a:graphicFrameLocks noChangeAspect="1"/>
@@ -31,7 +31,7 @@
                   <pic:spPr>
                     <a:xfrm>
                       <a:off x="0" y="0"/>
-                      <a:ext cx="2560320" cy="1177647"/>
+                      <a:ext cx="2286000" cy="1051471"/>
                     </a:xfrm>
                     <a:prstGeom prst="rect"/>
                   </pic:spPr>
@@ -52,14 +52,14 @@
           <w:rFonts w:ascii="Calibri" w:hAnsi="Calibri"/>
           <w:b/>
           <w:color w:val="2563EB"/>
-          <w:sz w:val="48"/>
+          <w:sz w:val="44"/>
         </w:rPr>
-        <w:t>Jumeau Numérique 3D &amp; Orientation Indoor</w:t>
+        <w:t>JUMEAU NUMÉRIQUE 3D &amp; ORIENTATION INDOOR</w:t>
       </w:r>
     </w:p>
     <w:p>
       <w:pPr>
-        <w:spacing w:after="360"/>
+        <w:spacing w:after="320"/>
         <w:jc w:val="center"/>
       </w:pPr>
       <w:r>
@@ -67,16 +67,16 @@
           <w:rFonts w:ascii="Calibri" w:hAnsi="Calibri"/>
           <w:i/>
           <w:color w:val="64748B"/>
-          <w:sz w:val="26"/>
+          <w:sz w:val="24"/>
         </w:rPr>
-        <w:t>Rapport Technique &amp; Explicatif — Bâtiment Principal Étage R+1</w:t>
+        <w:t>Dossier Technique &amp; Explicatif Exhaustif — Étage R+1 du Bâtiment Principal</w:t>
         <w:br/>
         <w:t>École Nationale Supérieure d'Informatique pour l'Industrie et l'Entreprise (ensIIE)</w:t>
       </w:r>
     </w:p>
     <w:p>
       <w:pPr>
-        <w:spacing w:before="120" w:after="240"/>
+        <w:spacing w:before="80" w:after="200"/>
         <w:pBdr>
           <w:bottom w:val="single" w:sz="12" w:space="1" w:color="2563EB"/>
         </w:pBdr>
@@ -85,16 +85,16 @@
     <w:p>
       <w:pPr>
         <w:keepNext/>
-        <w:spacing w:before="360" w:after="120"/>
+        <w:spacing w:before="320" w:after="120"/>
       </w:pPr>
       <w:r>
         <w:rPr>
           <w:rFonts w:ascii="Calibri" w:hAnsi="Calibri"/>
           <w:b/>
           <w:color w:val="2563EB"/>
-          <w:sz w:val="32"/>
+          <w:sz w:val="30"/>
         </w:rPr>
-        <w:t>1. Contexte &amp; Objectif du Projet</w:t>
+        <w:t>1. Contexte &amp; Objectifs du Projet</w:t>
       </w:r>
     </w:p>
     <w:p>
@@ -105,9 +105,9 @@
         <w:rPr>
           <w:rFonts w:ascii="Calibri" w:hAnsi="Calibri"/>
           <w:color w:val="0F172A"/>
-          <w:sz w:val="21"/>
+          <w:sz w:val="20"/>
         </w:rPr>
-        <w:t>Ce projet répond à une problématique centrale de l'ensIIE : faciliter l'orientation des étudiants, intervenants extérieurs, visiteurs et personnels au sein du bâtiment principal. L'étage R+1 rassemble une grande diversité d'usages : amphithéâtres majeurs, salles de TP spécialisées, rotonde de vie étudiante et 18 bureaux d'enseignants-chercheurs.</w:t>
+        <w:t>L'étage R+1 du bâtiment principal de l'ensIIE est le cœur névralgique académique de l'école. Il concentre les grands amphithéâtres (101, 102, 123), 4 salles de TP informatique, 10 salles de TD, la Rotonde centrale étudiante, ainsi que 18 bureaux d'enseignants-chercheurs et de la direction.</w:t>
       </w:r>
     </w:p>
     <w:p>
@@ -118,154 +118,167 @@
         <w:rPr>
           <w:rFonts w:ascii="Calibri" w:hAnsi="Calibri"/>
           <w:color w:val="0F172A"/>
-          <w:sz w:val="21"/>
+          <w:sz w:val="20"/>
         </w:rPr>
-        <w:t>La solution développée est un Jumeau Numérique 3D temps réel combiné à un calculateur d'itinéraire indoor autonome, respectant scrupuleusement les contraintes réelles de circulation du bâtiment.</w:t>
+        <w:t>Ce projet a été conçu pour résoudre le problème récurrent d'orientation rencontré par les nouveaux étudiants, les conférenciers, les entreprises et les personnes à mobilité réduite (PMR).</w:t>
       </w:r>
     </w:p>
     <w:p>
       <w:pPr>
         <w:keepNext/>
-        <w:spacing w:before="240" w:after="80"/>
+        <w:spacing w:before="220" w:after="80"/>
       </w:pPr>
       <w:r>
         <w:rPr>
           <w:rFonts w:ascii="Calibri" w:hAnsi="Calibri"/>
           <w:b/>
           <w:color w:val="0F172A"/>
-          <w:sz w:val="26"/>
+          <w:sz w:val="25"/>
         </w:rPr>
-        <w:t>Objectifs clés atteints :</w:t>
+        <w:t>Les 5 piliers de la solution :</w:t>
       </w:r>
     </w:p>
     <w:p>
       <w:pPr>
         <w:pStyle w:val="ListBullet"/>
-        <w:spacing w:after="60" w:line="276" w:lineRule="auto"/>
+        <w:spacing w:after="50" w:line="276" w:lineRule="auto"/>
       </w:pPr>
       <w:r>
         <w:rPr>
           <w:rFonts w:ascii="Calibri" w:hAnsi="Calibri"/>
           <w:b/>
           <w:color w:val="0F172A"/>
-          <w:sz w:val="20"/>
+          <w:sz w:val="19"/>
         </w:rPr>
-        <w:t xml:space="preserve">1. Zéro invention : </w:t>
+        <w:t xml:space="preserve">1. Réalisme Absolu : </w:t>
       </w:r>
+      <w:r>
+        <w:rPr>
+          <w:rFonts w:ascii="Calibri" w:hAnsi="Calibri"/>
+          <w:color w:val="0F172A"/>
+          <w:sz w:val="19"/>
+        </w:rPr>
+        <w:t>Aucune salle approximative. Chaque espace provient fidèlement des plans architecturaux d'origine (GeoJSON officiel).</w:t>
+      </w:r>
+    </w:p>
+    <w:p>
+      <w:pPr>
+        <w:pStyle w:val="ListBullet"/>
+        <w:spacing w:after="50" w:line="276" w:lineRule="auto"/>
+      </w:pPr>
+      <w:r>
+        <w:rPr>
+          <w:rFonts w:ascii="Calibri" w:hAnsi="Calibri"/>
+          <w:b/>
+          <w:color w:val="0F172A"/>
+          <w:sz w:val="19"/>
+        </w:rPr>
+        <w:t xml:space="preserve">2. Guidage 100% Couloirs : </w:t>
+      </w:r>
+      <w:r>
+        <w:rPr>
+          <w:rFonts w:ascii="Calibri" w:hAnsi="Calibri"/>
+          <w:color w:val="0F172A"/>
+          <w:sz w:val="19"/>
+        </w:rPr>
+        <w:t>Calcul mathématique rigoureux garantissant que 100% des itinéraires restent dans les couloirs et ne traversent jamais une salle fermée.</w:t>
+      </w:r>
+    </w:p>
+    <w:p>
+      <w:pPr>
+        <w:pStyle w:val="ListBullet"/>
+        <w:spacing w:after="50" w:line="276" w:lineRule="auto"/>
+      </w:pPr>
+      <w:r>
+        <w:rPr>
+          <w:rFonts w:ascii="Calibri" w:hAnsi="Calibri"/>
+          <w:b/>
+          <w:color w:val="0F172A"/>
+          <w:sz w:val="19"/>
+        </w:rPr>
+        <w:t xml:space="preserve">3. Guidage Pas à Pas : </w:t>
+      </w:r>
+      <w:r>
+        <w:rPr>
+          <w:rFonts w:ascii="Calibri" w:hAnsi="Calibri"/>
+          <w:color w:val="0F172A"/>
+          <w:sz w:val="19"/>
+        </w:rPr>
+        <w:t>Instructions GPS claires avec flèches de direction (⬆️ Tout droit, ↰ Tourner à gauche, ↱ Tourner à droite) et distances réelles.</w:t>
+      </w:r>
+    </w:p>
+    <w:p>
+      <w:pPr>
+        <w:pStyle w:val="ListBullet"/>
+        <w:spacing w:after="50" w:line="276" w:lineRule="auto"/>
+      </w:pPr>
+      <w:r>
+        <w:rPr>
+          <w:rFonts w:ascii="Calibri" w:hAnsi="Calibri"/>
+          <w:b/>
+          <w:color w:val="0F172A"/>
+          <w:sz w:val="19"/>
+        </w:rPr>
+        <w:t xml:space="preserve">4. Ergonomie Visuelle : </w:t>
+      </w:r>
+      <w:r>
+        <w:rPr>
+          <w:rFonts w:ascii="Calibri" w:hAnsi="Calibri"/>
+          <w:color w:val="0F172A"/>
+          <w:sz w:val="19"/>
+        </w:rPr>
+        <w:t>Code couleur contrasté éliminant les confusions de nuances de bleu (Amphis en rouge, TP en cyan, TD en orange, Bureaux en vert, Rotonde en violet).</w:t>
+      </w:r>
+    </w:p>
+    <w:p>
+      <w:pPr>
+        <w:pStyle w:val="ListBullet"/>
+        <w:spacing w:after="50" w:line="276" w:lineRule="auto"/>
+      </w:pPr>
+      <w:r>
+        <w:rPr>
+          <w:rFonts w:ascii="Calibri" w:hAnsi="Calibri"/>
+          <w:b/>
+          <w:color w:val="0F172A"/>
+          <w:sz w:val="19"/>
+        </w:rPr>
+        <w:t xml:space="preserve">5. Autonomie Complète : </w:t>
+      </w:r>
+      <w:r>
+        <w:rPr>
+          <w:rFonts w:ascii="Calibri" w:hAnsi="Calibri"/>
+          <w:color w:val="0F172A"/>
+          <w:sz w:val="19"/>
+        </w:rPr>
+        <w:t>L'application fonctionne immédiatement dans n'importe quel navigateur via HTTP local ou hébergé, sans installation préalable de logiciel.</w:t>
+      </w:r>
+    </w:p>
+    <w:p>
+      <w:pPr>
+        <w:keepNext/>
+        <w:spacing w:before="320" w:after="120"/>
+      </w:pPr>
+      <w:r>
+        <w:rPr>
+          <w:rFonts w:ascii="Calibri" w:hAnsi="Calibri"/>
+          <w:b/>
+          <w:color w:val="2563EB"/>
+          <w:sz w:val="30"/>
+        </w:rPr>
+        <w:t>2. Architecture Système &amp; Stack Technologique</w:t>
+      </w:r>
+    </w:p>
+    <w:p>
+      <w:pPr>
+        <w:spacing w:after="80" w:line="276" w:lineRule="auto"/>
+      </w:pPr>
       <w:r>
         <w:rPr>
           <w:rFonts w:ascii="Calibri" w:hAnsi="Calibri"/>
           <w:color w:val="0F172A"/>
           <w:sz w:val="20"/>
         </w:rPr>
-        <w:t>Modélisation fidèle de l'ensemble des 48 espaces réels (polygones d'architecte officiels).</w:t>
-      </w:r>
-    </w:p>
-    <w:p>
-      <w:pPr>
-        <w:pStyle w:val="ListBullet"/>
-        <w:spacing w:after="60" w:line="276" w:lineRule="auto"/>
-      </w:pPr>
-      <w:r>
-        <w:rPr>
-          <w:rFonts w:ascii="Calibri" w:hAnsi="Calibri"/>
-          <w:b/>
-          <w:color w:val="0F172A"/>
-          <w:sz w:val="20"/>
-        </w:rPr>
-        <w:t xml:space="preserve">2. Réseau couloirs vérifié : </w:t>
-      </w:r>
-      <w:r>
-        <w:rPr>
-          <w:rFonts w:ascii="Calibri" w:hAnsi="Calibri"/>
-          <w:color w:val="0F172A"/>
-          <w:sz w:val="20"/>
-        </w:rPr>
-        <w:t>Garantie absolue que les itinéraires suivent uniquement les couloirs d'évacuation (zéro traversée de salle fermée).</w:t>
-      </w:r>
-    </w:p>
-    <w:p>
-      <w:pPr>
-        <w:pStyle w:val="ListBullet"/>
-        <w:spacing w:after="60" w:line="276" w:lineRule="auto"/>
-      </w:pPr>
-      <w:r>
-        <w:rPr>
-          <w:rFonts w:ascii="Calibri" w:hAnsi="Calibri"/>
-          <w:b/>
-          <w:color w:val="0F172A"/>
-          <w:sz w:val="20"/>
-        </w:rPr>
-        <w:t xml:space="preserve">3. Guidage pas à pas : </w:t>
-      </w:r>
-      <w:r>
-        <w:rPr>
-          <w:rFonts w:ascii="Calibri" w:hAnsi="Calibri"/>
-          <w:color w:val="0F172A"/>
-          <w:sz w:val="20"/>
-        </w:rPr>
-        <w:t>Instructions précises avec flèches (⬆️ Tout droit, ↰ Gauche, ↱ Droite, 🎯 Arrivée), distances en mètres et repères.</w:t>
-      </w:r>
-    </w:p>
-    <w:p>
-      <w:pPr>
-        <w:pStyle w:val="ListBullet"/>
-        <w:spacing w:after="60" w:line="276" w:lineRule="auto"/>
-      </w:pPr>
-      <w:r>
-        <w:rPr>
-          <w:rFonts w:ascii="Calibri" w:hAnsi="Calibri"/>
-          <w:b/>
-          <w:color w:val="0F172A"/>
-          <w:sz w:val="20"/>
-        </w:rPr>
-        <w:t xml:space="preserve">4. Accessibilité PMR : </w:t>
-      </w:r>
-      <w:r>
-        <w:rPr>
-          <w:rFonts w:ascii="Calibri" w:hAnsi="Calibri"/>
-          <w:color w:val="0F172A"/>
-          <w:sz w:val="20"/>
-        </w:rPr>
-        <w:t>Mode PMR dédié réorientant les usagers vers l'ascenseur pour éviter les escaliers.</w:t>
-      </w:r>
-    </w:p>
-    <w:p>
-      <w:pPr>
-        <w:pStyle w:val="ListBullet"/>
-        <w:spacing w:after="60" w:line="276" w:lineRule="auto"/>
-      </w:pPr>
-      <w:r>
-        <w:rPr>
-          <w:rFonts w:ascii="Calibri" w:hAnsi="Calibri"/>
-          <w:b/>
-          <w:color w:val="0F172A"/>
-          <w:sz w:val="20"/>
-        </w:rPr>
-        <w:t xml:space="preserve">5. 100% Autonome : </w:t>
-      </w:r>
-      <w:r>
-        <w:rPr>
-          <w:rFonts w:ascii="Calibri" w:hAnsi="Calibri"/>
-          <w:color w:val="0F172A"/>
-          <w:sz w:val="20"/>
-        </w:rPr>
-        <w:t>L'application fonctionne en local ou hébergée, sans aucune dépendance logicielle lourde.</w:t>
-      </w:r>
-    </w:p>
-    <w:p>
-      <w:pPr>
-        <w:keepNext/>
-        <w:spacing w:before="360" w:after="120"/>
-      </w:pPr>
-      <w:r>
-        <w:rPr>
-          <w:rFonts w:ascii="Calibri" w:hAnsi="Calibri"/>
-          <w:b/>
-          <w:color w:val="2563EB"/>
-          <w:sz w:val="32"/>
-        </w:rPr>
-        <w:t>2. Architecture Technique &amp; Outils Utilisés</w:t>
+        <w:t>Le projet repose sur une architecture moderne sans framework lourd, assurant un temps de chargement inférieur à 1 seconde et une compatibilité maximale :</w:t>
       </w:r>
     </w:p>
     <w:tbl>
@@ -290,7 +303,7 @@
               <w:rPr>
                 <w:b/>
                 <w:color w:val="FFFFFF"/>
-                <w:sz w:val="19"/>
+                <w:sz w:val="18"/>
               </w:rPr>
               <w:t>Composant</w:t>
             </w:r>
@@ -306,9 +319,9 @@
               <w:rPr>
                 <w:b/>
                 <w:color w:val="FFFFFF"/>
-                <w:sz w:val="19"/>
+                <w:sz w:val="18"/>
               </w:rPr>
-              <w:t>Technologie / Librairie</w:t>
+              <w:t>Technologie</w:t>
             </w:r>
           </w:p>
         </w:tc>
@@ -322,9 +335,9 @@
               <w:rPr>
                 <w:b/>
                 <w:color w:val="FFFFFF"/>
-                <w:sz w:val="19"/>
+                <w:sz w:val="18"/>
               </w:rPr>
-              <w:t>Rôle dans la plateforme</w:t>
+              <w:t>Rôle &amp; Détails d'Implémentation</w:t>
             </w:r>
           </w:p>
         </w:tc>
@@ -337,9 +350,9 @@
           <w:p>
             <w:r>
               <w:rPr>
-                <w:sz w:val="18"/>
+                <w:sz w:val="17"/>
               </w:rPr>
-              <w:t>Moteur 3D</w:t>
+              <w:t>Moteur 3D WebGL</w:t>
             </w:r>
           </w:p>
         </w:tc>
@@ -350,9 +363,9 @@
           <w:p>
             <w:r>
               <w:rPr>
-                <w:sz w:val="18"/>
+                <w:sz w:val="17"/>
               </w:rPr>
-              <w:t>Three.js (r128) + OrbitControls</w:t>
+              <w:t>Three.js r128 + OrbitControls</w:t>
             </w:r>
           </w:p>
         </w:tc>
@@ -363,9 +376,9 @@
           <w:p>
             <w:r>
               <w:rPr>
-                <w:sz w:val="18"/>
+                <w:sz w:val="17"/>
               </w:rPr>
-              <w:t>Rendu WebGL accéléré matériellement, extrusion polygonale 3D, éclairage, ombres et navigation caméra.</w:t>
+              <w:t>Rendu temps réel accéléré par le GPU. Gestion de la caméra orthographique/perspective, de l'éclairage ambiant/directionnel, du raycasting (clic sur les salles) et des animations d'extrusion polygonale.</w:t>
             </w:r>
           </w:p>
         </w:tc>
@@ -378,9 +391,9 @@
           <w:p>
             <w:r>
               <w:rPr>
-                <w:sz w:val="18"/>
+                <w:sz w:val="17"/>
               </w:rPr>
-              <w:t>Interface &amp; Logique</w:t>
+              <w:t>Interface Web</w:t>
             </w:r>
           </w:p>
         </w:tc>
@@ -391,9 +404,9 @@
           <w:p>
             <w:r>
               <w:rPr>
-                <w:sz w:val="18"/>
+                <w:sz w:val="17"/>
               </w:rPr>
-              <w:t>HTML5 / CSS3 / JavaScript ES6</w:t>
+              <w:t>HTML5 Sémantique + CSS3 Grid/Flexbox</w:t>
             </w:r>
           </w:p>
         </w:tc>
@@ -404,9 +417,9 @@
           <w:p>
             <w:r>
               <w:rPr>
-                <w:sz w:val="18"/>
+                <w:sz w:val="17"/>
               </w:rPr>
-              <w:t>Interface responsive, réactive et fluide sans framework lourd. Temps de chargement instantané (&lt; 1s).</w:t>
+              <w:t>Design moderne 'dark glassmorphism' haute performance. Barre latérale ergonomique avec recherche instantanée et filtres par catégorie.</w:t>
             </w:r>
           </w:p>
         </w:tc>
@@ -419,9 +432,9 @@
           <w:p>
             <w:r>
               <w:rPr>
-                <w:sz w:val="18"/>
+                <w:sz w:val="17"/>
               </w:rPr>
-              <w:t>Audit Géométrique</w:t>
+              <w:t>Logique &amp; Navigation</w:t>
             </w:r>
           </w:p>
         </w:tc>
@@ -432,9 +445,9 @@
           <w:p>
             <w:r>
               <w:rPr>
-                <w:sz w:val="18"/>
+                <w:sz w:val="17"/>
               </w:rPr>
-              <w:t>Python 3 &amp; Shapely</w:t>
+              <w:t>JavaScript ES6+ Vanilla</w:t>
             </w:r>
           </w:p>
         </w:tc>
@@ -445,9 +458,9 @@
           <w:p>
             <w:r>
               <w:rPr>
-                <w:sz w:val="18"/>
+                <w:sz w:val="17"/>
               </w:rPr>
-              <w:t>Calcul spatial vectoriel. Vérification mathématique stricte que les arêtes du graphe ne coupent aucune salle.</w:t>
+              <w:t>Calcul de trajectoire, gestion des événements de sélection, interpolation caméra et génération des instructions virage par virage sans dépendance externe.</w:t>
             </w:r>
           </w:p>
         </w:tc>
@@ -460,9 +473,9 @@
           <w:p>
             <w:r>
               <w:rPr>
-                <w:sz w:val="18"/>
+                <w:sz w:val="17"/>
               </w:rPr>
-              <w:t>Calcul d'Itinéraire</w:t>
+              <w:t>Algorithme d'Itinéraire</w:t>
             </w:r>
           </w:p>
         </w:tc>
@@ -473,9 +486,9 @@
           <w:p>
             <w:r>
               <w:rPr>
-                <w:sz w:val="18"/>
+                <w:sz w:val="17"/>
               </w:rPr>
-              <w:t>Algorithme de Dijkstra (JS)</w:t>
+              <w:t>Algorithme de Dijkstra</w:t>
             </w:r>
           </w:p>
         </w:tc>
@@ -486,9 +499,9 @@
           <w:p>
             <w:r>
               <w:rPr>
-                <w:sz w:val="18"/>
+                <w:sz w:val="17"/>
               </w:rPr>
-              <w:t>Calcul polynomial du chemin le plus court dans le graphe pondéré par les distances euclidiennes.</w:t>
+              <w:t>Recherche du plus court chemin pondéré par les distances euclidiennes dans le graphe topologique des couloirs.</w:t>
             </w:r>
           </w:p>
         </w:tc>
@@ -501,7 +514,48 @@
           <w:p>
             <w:r>
               <w:rPr>
-                <w:sz w:val="18"/>
+                <w:sz w:val="17"/>
+              </w:rPr>
+              <w:t>Audit Spatiale</w:t>
+            </w:r>
+          </w:p>
+        </w:tc>
+        <w:tc>
+          <w:tcPr>
+            <w:tcW w:type="dxa" w:w="3312"/>
+          </w:tcPr>
+          <w:p>
+            <w:r>
+              <w:rPr>
+                <w:sz w:val="17"/>
+              </w:rPr>
+              <w:t>Python 3 + Shapely (Vector Geometry)</w:t>
+            </w:r>
+          </w:p>
+        </w:tc>
+        <w:tc>
+          <w:tcPr>
+            <w:tcW w:type="dxa" w:w="3312"/>
+          </w:tcPr>
+          <w:p>
+            <w:r>
+              <w:rPr>
+                <w:sz w:val="17"/>
+              </w:rPr>
+              <w:t>Validation spatiale des intersections géométriques entre les arêtes du graphe de couloir et l'union des polygones des pièces fermées.</w:t>
+            </w:r>
+          </w:p>
+        </w:tc>
+      </w:tr>
+      <w:tr>
+        <w:tc>
+          <w:tcPr>
+            <w:tcW w:type="dxa" w:w="3312"/>
+          </w:tcPr>
+          <w:p>
+            <w:r>
+              <w:rPr>
+                <w:sz w:val="17"/>
               </w:rPr>
               <w:t>Données Géométriques</w:t>
             </w:r>
@@ -514,7 +568,7 @@
           <w:p>
             <w:r>
               <w:rPr>
-                <w:sz w:val="18"/>
+                <w:sz w:val="17"/>
               </w:rPr>
               <w:t>GeoJSON (pieces_R+1.geojson)</w:t>
             </w:r>
@@ -527,9 +581,9 @@
           <w:p>
             <w:r>
               <w:rPr>
-                <w:sz w:val="18"/>
+                <w:sz w:val="17"/>
               </w:rPr>
-              <w:t>Coordonnées vectorielles réelles issues des plans d'architecte originaux de l'école.</w:t>
+              <w:t>Contours vectoriels réels issus des relevés topographiques et architecturaux de l'école ensIIE.</w:t>
             </w:r>
           </w:p>
         </w:tc>
@@ -542,7 +596,7 @@
           <w:p>
             <w:r>
               <w:rPr>
-                <w:sz w:val="18"/>
+                <w:sz w:val="17"/>
               </w:rPr>
               <w:t>Registre Métier</w:t>
             </w:r>
@@ -555,7 +609,7 @@
           <w:p>
             <w:r>
               <w:rPr>
-                <w:sz w:val="18"/>
+                <w:sz w:val="17"/>
               </w:rPr>
               <w:t>CSV / JSON (salles.csv, salles_R1.json)</w:t>
             </w:r>
@@ -568,50 +622,9 @@
           <w:p>
             <w:r>
               <w:rPr>
-                <w:sz w:val="18"/>
+                <w:sz w:val="17"/>
               </w:rPr>
-              <w:t>Affectation des enseignants aux bureaux, plannings réels, capacités, surfaces et statuts libres/occupés.</w:t>
-            </w:r>
-          </w:p>
-        </w:tc>
-      </w:tr>
-      <w:tr>
-        <w:tc>
-          <w:tcPr>
-            <w:tcW w:type="dxa" w:w="3312"/>
-          </w:tcPr>
-          <w:p>
-            <w:r>
-              <w:rPr>
-                <w:sz w:val="18"/>
-              </w:rPr>
-              <w:t>Versionnage &amp; Déploiement</w:t>
-            </w:r>
-          </w:p>
-        </w:tc>
-        <w:tc>
-          <w:tcPr>
-            <w:tcW w:type="dxa" w:w="3312"/>
-          </w:tcPr>
-          <w:p>
-            <w:r>
-              <w:rPr>
-                <w:sz w:val="18"/>
-              </w:rPr>
-              <w:t>Git &amp; GitHub</w:t>
-            </w:r>
-          </w:p>
-        </w:tc>
-        <w:tc>
-          <w:tcPr>
-            <w:tcW w:type="dxa" w:w="3312"/>
-          </w:tcPr>
-          <w:p>
-            <w:r>
-              <w:rPr>
-                <w:sz w:val="18"/>
-              </w:rPr>
-              <w:t>Dépôt distant collaboratif synchronisé sur la branche main (https://github.com/Agathe-lcn/Jumeau-numerique).</w:t>
+              <w:t>Inventaire exhaustif des 47 salles du R+1 : noms officiels, professeurs assignés, capacités, surfaces réelles et photos.</w:t>
             </w:r>
           </w:p>
         </w:tc>
@@ -620,16 +633,16 @@
     <w:p>
       <w:pPr>
         <w:keepNext/>
-        <w:spacing w:before="360" w:after="120"/>
+        <w:spacing w:before="320" w:after="120"/>
       </w:pPr>
       <w:r>
         <w:rPr>
           <w:rFonts w:ascii="Calibri" w:hAnsi="Calibri"/>
           <w:b/>
           <w:color w:val="2563EB"/>
-          <w:sz w:val="32"/>
+          <w:sz w:val="30"/>
         </w:rPr>
-        <w:t>3. Traitement des Données Réelles (Zéro Invention)</w:t>
+        <w:t>3. Traitement des Données Réelles de l'Étage R+1</w:t>
       </w:r>
     </w:p>
     <w:p>
@@ -640,22 +653,22 @@
         <w:rPr>
           <w:rFonts w:ascii="Calibri" w:hAnsi="Calibri"/>
           <w:color w:val="0F172A"/>
-          <w:sz w:val="21"/>
+          <w:sz w:val="20"/>
         </w:rPr>
-        <w:t>Toutes les informations ont été extraites des fichiers sources fournis par l'ensIIE :</w:t>
+        <w:t>Aucune donnée n'a été inventée. Le jeu de données officiel comprend exactement 47 espaces inventoriés au R+1 :</w:t>
       </w:r>
     </w:p>
     <w:p>
       <w:pPr>
         <w:pStyle w:val="ListBullet"/>
-        <w:spacing w:after="60" w:line="276" w:lineRule="auto"/>
+        <w:spacing w:after="50" w:line="276" w:lineRule="auto"/>
       </w:pPr>
       <w:r>
         <w:rPr>
           <w:rFonts w:ascii="Calibri" w:hAnsi="Calibri"/>
           <w:b/>
           <w:color w:val="0F172A"/>
-          <w:sz w:val="20"/>
+          <w:sz w:val="19"/>
         </w:rPr>
         <w:t xml:space="preserve">• Amphithéâtres (3) : </w:t>
       </w:r>
@@ -663,168 +676,168 @@
         <w:rPr>
           <w:rFonts w:ascii="Calibri" w:hAnsi="Calibri"/>
           <w:color w:val="0F172A"/>
-          <w:sz w:val="20"/>
+          <w:sz w:val="19"/>
         </w:rPr>
-        <w:t>Amphi 101, Amphi 102, Amphi 123.</w:t>
+        <w:t>Amphi 101 (100 places), Amphi 102 (100 places), Amphi 123 (40 places).</w:t>
       </w:r>
     </w:p>
     <w:p>
       <w:pPr>
         <w:pStyle w:val="ListBullet"/>
-        <w:spacing w:after="60" w:line="276" w:lineRule="auto"/>
+        <w:spacing w:after="50" w:line="276" w:lineRule="auto"/>
       </w:pPr>
       <w:r>
         <w:rPr>
           <w:rFonts w:ascii="Calibri" w:hAnsi="Calibri"/>
           <w:b/>
           <w:color w:val="0F172A"/>
-          <w:sz w:val="20"/>
+          <w:sz w:val="19"/>
         </w:rPr>
-        <w:t xml:space="preserve">• Salles de TP Informatique (4) : </w:t>
+        <w:t xml:space="preserve">• Salles de Travaux Pratiques Informatique (4) : </w:t>
       </w:r>
       <w:r>
         <w:rPr>
           <w:rFonts w:ascii="Calibri" w:hAnsi="Calibri"/>
           <w:color w:val="0F172A"/>
-          <w:sz w:val="20"/>
+          <w:sz w:val="19"/>
         </w:rPr>
-        <w:t>Salles 127, 130, 131, 133.</w:t>
+        <w:t>Salle 127 (30 places), Salle 130 (41 places), Salle 131 (42 places), Salle 133 (38 places).</w:t>
       </w:r>
     </w:p>
     <w:p>
       <w:pPr>
         <w:pStyle w:val="ListBullet"/>
-        <w:spacing w:after="60" w:line="276" w:lineRule="auto"/>
+        <w:spacing w:after="50" w:line="276" w:lineRule="auto"/>
       </w:pPr>
       <w:r>
         <w:rPr>
           <w:rFonts w:ascii="Calibri" w:hAnsi="Calibri"/>
           <w:b/>
           <w:color w:val="0F172A"/>
-          <w:sz w:val="20"/>
+          <w:sz w:val="19"/>
         </w:rPr>
-        <w:t xml:space="preserve">• Salles de TD (10) : </w:t>
+        <w:t xml:space="preserve">• Salles de Travaux Dirigés (10) : </w:t>
       </w:r>
       <w:r>
         <w:rPr>
           <w:rFonts w:ascii="Calibri" w:hAnsi="Calibri"/>
           <w:color w:val="0F172A"/>
-          <w:sz w:val="20"/>
+          <w:sz w:val="19"/>
         </w:rPr>
-        <w:t>Salles 121, 122, 126, 135, 136, 138, 139, 141, 148, 149.</w:t>
+        <w:t>121, 122 (30 pl.), 126 (30 pl.), 135 (32 pl.), 136 (35 pl.), 138 (28 pl.), 139 (36 pl.), 141, 148 (35 pl.), 149 (30 pl.).</w:t>
       </w:r>
     </w:p>
     <w:p>
       <w:pPr>
         <w:pStyle w:val="ListBullet"/>
-        <w:spacing w:after="60" w:line="276" w:lineRule="auto"/>
+        <w:spacing w:after="50" w:line="276" w:lineRule="auto"/>
       </w:pPr>
       <w:r>
         <w:rPr>
           <w:rFonts w:ascii="Calibri" w:hAnsi="Calibri"/>
           <w:b/>
           <w:color w:val="0F172A"/>
-          <w:sz w:val="20"/>
+          <w:sz w:val="19"/>
         </w:rPr>
-        <w:t xml:space="preserve">• Bureaux Enseignants (18) : </w:t>
+        <w:t xml:space="preserve">• Bureaux des Enseignants-Chercheurs (16) : </w:t>
       </w:r>
       <w:r>
         <w:rPr>
           <w:rFonts w:ascii="Calibri" w:hAnsi="Calibri"/>
           <w:color w:val="0F172A"/>
-          <w:sz w:val="20"/>
+          <w:sz w:val="19"/>
         </w:rPr>
-        <w:t>104 à 111, 112, 113, 114, 117, 118 à 120, 143, 144, 146 avec les enseignants titulaires (Massinissa Merabet, Vathana Ly Vath, Mathilde Mougeot, Nicolas Brunel, Abass Sagna, Catherine Dubois, David Roussel, etc.).</w:t>
+        <w:t>104 (Merabet, Dumbrava), 105 (Ly Vath), 106, 107 (Mougeot), 108 (Brunel), 109 (Sagna), 110 (Dubois), 111 (Roussel, Bouyer), 112 (Ligozat), 113 (Pulido Nino), 118 (Alrazouk, Enfroy, Ziani), 119 (Park, Vo), 120 (Arioli), 143 (Jadot), 144 (Thomas, Coulibaly, Aounallah), 146 (Nordine).</w:t>
       </w:r>
     </w:p>
     <w:p>
       <w:pPr>
         <w:pStyle w:val="ListBullet"/>
-        <w:spacing w:after="60" w:line="276" w:lineRule="auto"/>
+        <w:spacing w:after="50" w:line="276" w:lineRule="auto"/>
       </w:pPr>
       <w:r>
         <w:rPr>
           <w:rFonts w:ascii="Calibri" w:hAnsi="Calibri"/>
           <w:b/>
           <w:color w:val="0F172A"/>
-          <w:sz w:val="20"/>
+          <w:sz w:val="19"/>
         </w:rPr>
-        <w:t xml:space="preserve">• Espace Central : </w:t>
+        <w:t xml:space="preserve">• Espace Central de Vie : </w:t>
       </w:r>
       <w:r>
         <w:rPr>
           <w:rFonts w:ascii="Calibri" w:hAnsi="Calibri"/>
           <w:color w:val="0F172A"/>
-          <w:sz w:val="20"/>
+          <w:sz w:val="19"/>
         </w:rPr>
-        <w:t>Rotonde 103 (vie étudiante &amp; carrefour central).</w:t>
+        <w:t>Rotonde 103 (105 m² - carrefour central des étudiants).</w:t>
       </w:r>
     </w:p>
     <w:p>
       <w:pPr>
         <w:pStyle w:val="ListBullet"/>
-        <w:spacing w:after="60" w:line="276" w:lineRule="auto"/>
+        <w:spacing w:after="50" w:line="276" w:lineRule="auto"/>
       </w:pPr>
       <w:r>
         <w:rPr>
           <w:rFonts w:ascii="Calibri" w:hAnsi="Calibri"/>
           <w:b/>
           <w:color w:val="0F172A"/>
-          <w:sz w:val="20"/>
+          <w:sz w:val="19"/>
         </w:rPr>
-        <w:t xml:space="preserve">• Salle des Professeurs : </w:t>
+        <w:t xml:space="preserve">• Espace Enseignants : </w:t>
       </w:r>
       <w:r>
         <w:rPr>
           <w:rFonts w:ascii="Calibri" w:hAnsi="Calibri"/>
           <w:color w:val="0F172A"/>
-          <w:sz w:val="20"/>
+          <w:sz w:val="19"/>
         </w:rPr>
-        <w:t>Salle 115.</w:t>
+        <w:t>Salle 115 (33,5 m²).</w:t>
       </w:r>
     </w:p>
     <w:p>
       <w:pPr>
         <w:pStyle w:val="ListBullet"/>
-        <w:spacing w:after="60" w:line="276" w:lineRule="auto"/>
+        <w:spacing w:after="50" w:line="276" w:lineRule="auto"/>
       </w:pPr>
       <w:r>
         <w:rPr>
           <w:rFonts w:ascii="Calibri" w:hAnsi="Calibri"/>
           <w:b/>
           <w:color w:val="0F172A"/>
-          <w:sz w:val="20"/>
+          <w:sz w:val="19"/>
         </w:rPr>
-        <w:t xml:space="preserve">• Locaux Techniques : </w:t>
+        <w:t xml:space="preserve">• Services &amp; Locaux Techniques : </w:t>
       </w:r>
       <w:r>
         <w:rPr>
           <w:rFonts w:ascii="Calibri" w:hAnsi="Calibri"/>
           <w:color w:val="0F172A"/>
-          <w:sz w:val="20"/>
+          <w:sz w:val="19"/>
         </w:rPr>
-        <w:t>116 (Reprographie), 129, 137, 140 (Serveurs), 142.</w:t>
+        <w:t>117 (Salle de réunion), 114 (Réserve), 129 (Ménage), 137 (Local technique), 140 (Serveur informatique), 142 (Serveur étudiants).</w:t>
       </w:r>
     </w:p>
     <w:p>
       <w:pPr>
         <w:pStyle w:val="ListBullet"/>
-        <w:spacing w:after="60" w:line="276" w:lineRule="auto"/>
+        <w:spacing w:after="50" w:line="276" w:lineRule="auto"/>
       </w:pPr>
       <w:r>
         <w:rPr>
           <w:rFonts w:ascii="Calibri" w:hAnsi="Calibri"/>
           <w:b/>
           <w:color w:val="0F172A"/>
-          <w:sz w:val="20"/>
+          <w:sz w:val="19"/>
         </w:rPr>
-        <w:t xml:space="preserve">• Dépôts pédagogiques : </w:t>
+        <w:t xml:space="preserve">• Dépôts Pédagogiques : </w:t>
       </w:r>
       <w:r>
         <w:rPr>
           <w:rFonts w:ascii="Calibri" w:hAnsi="Calibri"/>
           <w:color w:val="0F172A"/>
-          <w:sz w:val="20"/>
+          <w:sz w:val="19"/>
         </w:rPr>
         <w:t>124, 125, 128, 132, 134, 150.</w:t>
       </w:r>
@@ -832,16 +845,16 @@
     <w:p>
       <w:pPr>
         <w:keepNext/>
-        <w:spacing w:before="360" w:after="120"/>
+        <w:spacing w:before="320" w:after="120"/>
       </w:pPr>
       <w:r>
         <w:rPr>
           <w:rFonts w:ascii="Calibri" w:hAnsi="Calibri"/>
           <w:b/>
           <w:color w:val="2563EB"/>
-          <w:sz w:val="32"/>
+          <w:sz w:val="30"/>
         </w:rPr>
-        <w:t>4. Moteur 3D &amp; Différenciation des Couleurs</w:t>
+        <w:t>4. Moteur de Rendu 3D &amp; Différenciation des Couleurs</w:t>
       </w:r>
     </w:p>
     <w:p>
@@ -852,9 +865,9 @@
         <w:rPr>
           <w:rFonts w:ascii="Calibri" w:hAnsi="Calibri"/>
           <w:color w:val="0F172A"/>
-          <w:sz w:val="21"/>
+          <w:sz w:val="20"/>
         </w:rPr>
-        <w:t>Pour éliminer toute ambiguïté visuelle liée à la multiplication de nuances de bleu, chaque typologie d'espace a été dotée d'une couleur primaire contrastée et harmonieuse :</w:t>
+        <w:t>Dans les versions initiales, la prédominance de multiples nuances de bleu rendait la lecture visuelle confuse. Une charte graphique polychromatique rigoureuse a été instaurée :</w:t>
       </w:r>
     </w:p>
     <w:tbl>
@@ -879,9 +892,9 @@
               <w:rPr>
                 <w:b/>
                 <w:color w:val="FFFFFF"/>
-                <w:sz w:val="19"/>
+                <w:sz w:val="18"/>
               </w:rPr>
-              <w:t>Catégorie d'Espace</w:t>
+              <w:t>Catégorie de Salle</w:t>
             </w:r>
           </w:p>
         </w:tc>
@@ -895,9 +908,9 @@
               <w:rPr>
                 <w:b/>
                 <w:color w:val="FFFFFF"/>
-                <w:sz w:val="19"/>
+                <w:sz w:val="18"/>
               </w:rPr>
-              <w:t>Code Couleur Hex</w:t>
+              <w:t>Code Couleur &amp; Nom</w:t>
             </w:r>
           </w:p>
         </w:tc>
@@ -911,9 +924,9 @@
               <w:rPr>
                 <w:b/>
                 <w:color w:val="FFFFFF"/>
-                <w:sz w:val="19"/>
+                <w:sz w:val="18"/>
               </w:rPr>
-              <w:t>Espaces Concernés</w:t>
+              <w:t>Salles concernées</w:t>
             </w:r>
           </w:p>
         </w:tc>
@@ -926,7 +939,7 @@
           <w:p>
             <w:r>
               <w:rPr>
-                <w:sz w:val="18"/>
+                <w:sz w:val="17"/>
               </w:rPr>
               <w:t>Amphithéâtres</w:t>
             </w:r>
@@ -939,9 +952,9 @@
           <w:p>
             <w:r>
               <w:rPr>
-                <w:sz w:val="18"/>
+                <w:sz w:val="17"/>
               </w:rPr>
-              <w:t>#ef4444 (Rouge carmin)</w:t>
+              <w:t>#ef4444 (Rouge Carmin)</w:t>
             </w:r>
           </w:p>
         </w:tc>
@@ -952,7 +965,7 @@
           <w:p>
             <w:r>
               <w:rPr>
-                <w:sz w:val="18"/>
+                <w:sz w:val="17"/>
               </w:rPr>
               <w:t>101, 102, 123</w:t>
             </w:r>
@@ -967,7 +980,7 @@
           <w:p>
             <w:r>
               <w:rPr>
-                <w:sz w:val="18"/>
+                <w:sz w:val="17"/>
               </w:rPr>
               <w:t>Salles de TP Info</w:t>
             </w:r>
@@ -980,9 +993,9 @@
           <w:p>
             <w:r>
               <w:rPr>
-                <w:sz w:val="18"/>
+                <w:sz w:val="17"/>
               </w:rPr>
-              <w:t>#06b6d4 (Cyan électrique)</w:t>
+              <w:t>#06b6d4 (Cyan Électrique)</w:t>
             </w:r>
           </w:p>
         </w:tc>
@@ -993,7 +1006,7 @@
           <w:p>
             <w:r>
               <w:rPr>
-                <w:sz w:val="18"/>
+                <w:sz w:val="17"/>
               </w:rPr>
               <w:t>127, 130, 131, 133</w:t>
             </w:r>
@@ -1008,7 +1021,7 @@
           <w:p>
             <w:r>
               <w:rPr>
-                <w:sz w:val="18"/>
+                <w:sz w:val="17"/>
               </w:rPr>
               <w:t>Salles de TD</w:t>
             </w:r>
@@ -1021,9 +1034,9 @@
           <w:p>
             <w:r>
               <w:rPr>
-                <w:sz w:val="18"/>
+                <w:sz w:val="17"/>
               </w:rPr>
-              <w:t>#f97316 (Orange vif)</w:t>
+              <w:t>#f97316 (Orange Vif)</w:t>
             </w:r>
           </w:p>
         </w:tc>
@@ -1034,7 +1047,7 @@
           <w:p>
             <w:r>
               <w:rPr>
-                <w:sz w:val="18"/>
+                <w:sz w:val="17"/>
               </w:rPr>
               <w:t>121, 122, 126, 135, 136, 138, 139, 141, 148, 149</w:t>
             </w:r>
@@ -1049,7 +1062,7 @@
           <w:p>
             <w:r>
               <w:rPr>
-                <w:sz w:val="18"/>
+                <w:sz w:val="17"/>
               </w:rPr>
               <w:t>Bureaux Enseignants</w:t>
             </w:r>
@@ -1062,7 +1075,7 @@
           <w:p>
             <w:r>
               <w:rPr>
-                <w:sz w:val="18"/>
+                <w:sz w:val="17"/>
               </w:rPr>
               <w:t>#10b981 (Vert Émeraude)</w:t>
             </w:r>
@@ -1075,9 +1088,9 @@
           <w:p>
             <w:r>
               <w:rPr>
-                <w:sz w:val="18"/>
+                <w:sz w:val="17"/>
               </w:rPr>
-              <w:t>104 à 111, 112-113, 114, 117, 118-120, 143, 144, 146</w:t>
+              <w:t>104 à 113, 118 à 120, 143, 144, 146</w:t>
             </w:r>
           </w:p>
         </w:tc>
@@ -1090,9 +1103,9 @@
           <w:p>
             <w:r>
               <w:rPr>
-                <w:sz w:val="18"/>
+                <w:sz w:val="17"/>
               </w:rPr>
-              <w:t>Rotonde 103</w:t>
+              <w:t>Rotonde Centrale</w:t>
             </w:r>
           </w:p>
         </w:tc>
@@ -1103,7 +1116,7 @@
           <w:p>
             <w:r>
               <w:rPr>
-                <w:sz w:val="18"/>
+                <w:sz w:val="17"/>
               </w:rPr>
               <w:t>#a855f7 (Violet Royal)</w:t>
             </w:r>
@@ -1116,9 +1129,9 @@
           <w:p>
             <w:r>
               <w:rPr>
-                <w:sz w:val="18"/>
+                <w:sz w:val="17"/>
               </w:rPr>
-              <w:t>Rotonde centrale (103)</w:t>
+              <w:t>Rotonde 103</w:t>
             </w:r>
           </w:p>
         </w:tc>
@@ -1131,9 +1144,9 @@
           <w:p>
             <w:r>
               <w:rPr>
-                <w:sz w:val="18"/>
+                <w:sz w:val="17"/>
               </w:rPr>
-              <w:t>Salle des Professeurs</w:t>
+              <w:t>Salle des Profs</w:t>
             </w:r>
           </w:p>
         </w:tc>
@@ -1144,9 +1157,9 @@
           <w:p>
             <w:r>
               <w:rPr>
-                <w:sz w:val="18"/>
+                <w:sz w:val="17"/>
               </w:rPr>
-              <w:t>#eab308 (Jaune d'Or)</w:t>
+              <w:t>#eab308 (Jaune Doré)</w:t>
             </w:r>
           </w:p>
         </w:tc>
@@ -1157,7 +1170,7 @@
           <w:p>
             <w:r>
               <w:rPr>
-                <w:sz w:val="18"/>
+                <w:sz w:val="17"/>
               </w:rPr>
               <w:t>Salle 115</w:t>
             </w:r>
@@ -1172,7 +1185,7 @@
           <w:p>
             <w:r>
               <w:rPr>
-                <w:sz w:val="18"/>
+                <w:sz w:val="17"/>
               </w:rPr>
               <w:t>Locaux Techniques &amp; Serveurs</w:t>
             </w:r>
@@ -1185,9 +1198,9 @@
           <w:p>
             <w:r>
               <w:rPr>
-                <w:sz w:val="18"/>
+                <w:sz w:val="17"/>
               </w:rPr>
-              <w:t>#475569 (Gris Ardoise foncé)</w:t>
+              <w:t>#475569 (Gris Ardoise)</w:t>
             </w:r>
           </w:p>
         </w:tc>
@@ -1198,7 +1211,7 @@
           <w:p>
             <w:r>
               <w:rPr>
-                <w:sz w:val="18"/>
+                <w:sz w:val="17"/>
               </w:rPr>
               <w:t>116, 129, 137, 140, 142</w:t>
             </w:r>
@@ -1213,7 +1226,7 @@
           <w:p>
             <w:r>
               <w:rPr>
-                <w:sz w:val="18"/>
+                <w:sz w:val="17"/>
               </w:rPr>
               <w:t>Dépôts Pédagogiques</w:t>
             </w:r>
@@ -1226,9 +1239,9 @@
           <w:p>
             <w:r>
               <w:rPr>
-                <w:sz w:val="18"/>
+                <w:sz w:val="17"/>
               </w:rPr>
-              <w:t>#9ca3af (Gris clair argenté)</w:t>
+              <w:t>#94a3b8 (Gris Métal clair)</w:t>
             </w:r>
           </w:p>
         </w:tc>
@@ -1239,7 +1252,7 @@
           <w:p>
             <w:r>
               <w:rPr>
-                <w:sz w:val="18"/>
+                <w:sz w:val="17"/>
               </w:rPr>
               <w:t>124, 125, 128, 132, 134, 150</w:t>
             </w:r>
@@ -1250,16 +1263,16 @@
     <w:p>
       <w:pPr>
         <w:keepNext/>
-        <w:spacing w:before="360" w:after="120"/>
+        <w:spacing w:before="320" w:after="120"/>
       </w:pPr>
       <w:r>
         <w:rPr>
           <w:rFonts w:ascii="Calibri" w:hAnsi="Calibri"/>
           <w:b/>
           <w:color w:val="2563EB"/>
-          <w:sz w:val="32"/>
+          <w:sz w:val="30"/>
         </w:rPr>
-        <w:t>5. Algorithme de Circulation Couloirs (0% Traversée de Salle)</w:t>
+        <w:t>5. Algorithme de Circulation dans les Couloirs (0% Traversée de Salles)</w:t>
       </w:r>
     </w:p>
     <w:p>
@@ -1270,131 +1283,131 @@
         <w:rPr>
           <w:rFonts w:ascii="Calibri" w:hAnsi="Calibri"/>
           <w:color w:val="0F172A"/>
-          <w:sz w:val="21"/>
+          <w:sz w:val="20"/>
         </w:rPr>
-        <w:t>L'ancienne version du graphe traversait accidentellement la salle 130 et d'autres espaces. Le réseau topologique a été entièrement reconstruit et rigoureusement audité avec la bibliothèque Python Shapely.</w:t>
+        <w:t>Le problème majeur résolu était la traversée accidentelle des salles (ex: traverser la salle 130 au lieu de contourner par le couloir). Une refonte topologique complète a été effectuée :</w:t>
       </w:r>
     </w:p>
     <w:p>
       <w:pPr>
         <w:keepNext/>
-        <w:spacing w:before="240" w:after="80"/>
+        <w:spacing w:before="220" w:after="80"/>
       </w:pPr>
       <w:r>
         <w:rPr>
           <w:rFonts w:ascii="Calibri" w:hAnsi="Calibri"/>
           <w:b/>
           <w:color w:val="0F172A"/>
-          <w:sz w:val="26"/>
+          <w:sz w:val="25"/>
         </w:rPr>
-        <w:t>Méthodologie de Validation Spatiale :</w:t>
+        <w:t>Méthodologie mathématique de validation :</w:t>
       </w:r>
     </w:p>
     <w:p>
       <w:pPr>
         <w:pStyle w:val="ListBullet"/>
-        <w:spacing w:after="60" w:line="276" w:lineRule="auto"/>
+        <w:spacing w:after="50" w:line="276" w:lineRule="auto"/>
       </w:pPr>
       <w:r>
         <w:rPr>
           <w:rFonts w:ascii="Calibri" w:hAnsi="Calibri"/>
           <w:b/>
           <w:color w:val="0F172A"/>
-          <w:sz w:val="20"/>
+          <w:sz w:val="19"/>
         </w:rPr>
-        <w:t xml:space="preserve">1. Espace de circulation : </w:t>
+        <w:t xml:space="preserve">1. Espace couloirs : </w:t>
       </w:r>
       <w:r>
         <w:rPr>
           <w:rFonts w:ascii="Calibri" w:hAnsi="Calibri"/>
           <w:color w:val="0F172A"/>
-          <w:sz w:val="20"/>
+          <w:sz w:val="19"/>
         </w:rPr>
-        <w:t>Extraction du polygone d'union des couloirs de circulation d'après pieces_R+1.geojson (surface totale : 1 043,45 m²).</w:t>
+        <w:t>Extraction du polygone d'union des zones de couloirs depuis pieces_R+1.geojson (surface de circulation totale = 1 043,45 m²).</w:t>
       </w:r>
     </w:p>
     <w:p>
       <w:pPr>
         <w:pStyle w:val="ListBullet"/>
-        <w:spacing w:after="60" w:line="276" w:lineRule="auto"/>
+        <w:spacing w:after="50" w:line="276" w:lineRule="auto"/>
       </w:pPr>
       <w:r>
         <w:rPr>
           <w:rFonts w:ascii="Calibri" w:hAnsi="Calibri"/>
           <w:b/>
           <w:color w:val="0F172A"/>
-          <w:sz w:val="20"/>
+          <w:sz w:val="19"/>
         </w:rPr>
-        <w:t xml:space="preserve">2. Empreinte des salles : </w:t>
+        <w:t xml:space="preserve">2. Empreinte des pièces : </w:t>
       </w:r>
       <w:r>
         <w:rPr>
           <w:rFonts w:ascii="Calibri" w:hAnsi="Calibri"/>
           <w:color w:val="0F172A"/>
-          <w:sz w:val="20"/>
+          <w:sz w:val="19"/>
         </w:rPr>
-        <w:t>Calcul de l'union des 48 polygones de salles fermées.</w:t>
+        <w:t>Calcul de l'union géométrique des 47 polygones de salles fermées.</w:t>
       </w:r>
     </w:p>
     <w:p>
       <w:pPr>
         <w:pStyle w:val="ListBullet"/>
-        <w:spacing w:after="60" w:line="276" w:lineRule="auto"/>
+        <w:spacing w:after="50" w:line="276" w:lineRule="auto"/>
       </w:pPr>
       <w:r>
         <w:rPr>
           <w:rFonts w:ascii="Calibri" w:hAnsi="Calibri"/>
           <w:b/>
           <w:color w:val="0F172A"/>
-          <w:sz w:val="20"/>
+          <w:sz w:val="19"/>
         </w:rPr>
-        <w:t xml:space="preserve">3. Nœuds de circulation : </w:t>
+        <w:t xml:space="preserve">3. Nœuds de graphe : </w:t>
       </w:r>
       <w:r>
         <w:rPr>
           <w:rFonts w:ascii="Calibri" w:hAnsi="Calibri"/>
           <w:color w:val="0F172A"/>
-          <w:sz w:val="20"/>
+          <w:sz w:val="19"/>
         </w:rPr>
-        <w:t>50 nœuds stratégiques positionnés strictement sur la ligne médiane des couloirs (Hub Sud, Colonne Centrale entre 130 et 138, Branche Nord-Ouest, Branche Nord-Est, Couloir Sud Bureaux).</w:t>
+        <w:t>50 nœuds topologiques ont été disposés le long de la ligne médiane des couloirs (Hub Sud, Colonne Centrale entre 130 et 138, Branche Nord-Ouest, Branche Nord-Est, Allée Sud des Bureaux).</w:t>
       </w:r>
     </w:p>
     <w:p>
       <w:pPr>
         <w:pStyle w:val="ListBullet"/>
-        <w:spacing w:after="60" w:line="276" w:lineRule="auto"/>
+        <w:spacing w:after="50" w:line="276" w:lineRule="auto"/>
       </w:pPr>
       <w:r>
         <w:rPr>
           <w:rFonts w:ascii="Calibri" w:hAnsi="Calibri"/>
           <w:b/>
           <w:color w:val="0F172A"/>
-          <w:sz w:val="20"/>
+          <w:sz w:val="19"/>
         </w:rPr>
-        <w:t xml:space="preserve">4. Zéro intersection : </w:t>
+        <w:t xml:space="preserve">4. Zéro collision : </w:t>
       </w:r>
       <w:r>
         <w:rPr>
           <w:rFonts w:ascii="Calibri" w:hAnsi="Calibri"/>
           <w:color w:val="0F172A"/>
-          <w:sz w:val="20"/>
+          <w:sz w:val="19"/>
         </w:rPr>
-        <w:t>Chaque arête [A, B] a été testée par intersection spatiale : all_rooms_union.intersection(line).length &lt; 0.05. Résultat validé : 0,00 mètre de traversée de salle pour 100% des trajets !</w:t>
+        <w:t>Chaque segment de liaison a été testé avec Shapely : intersection(all_rooms_union).length &lt; 0.05. Résultat validé : 0,00 m de traversée interdite.</w:t>
       </w:r>
     </w:p>
     <w:p>
       <w:pPr>
         <w:keepNext/>
-        <w:spacing w:before="360" w:after="120"/>
+        <w:spacing w:before="320" w:after="120"/>
       </w:pPr>
       <w:r>
         <w:rPr>
           <w:rFonts w:ascii="Calibri" w:hAnsi="Calibri"/>
           <w:b/>
           <w:color w:val="2563EB"/>
-          <w:sz w:val="32"/>
+          <w:sz w:val="30"/>
         </w:rPr>
-        <w:t>6. Moteur de Guidage Pas à Pas (Turn-by-Turn)</w:t>
+        <w:t>6. Moteur de Guidage Pas à Pas (Turn-by-Turn GPS)</w:t>
       </w:r>
     </w:p>
     <w:p>
@@ -1405,9 +1418,9 @@
         <w:rPr>
           <w:rFonts w:ascii="Calibri" w:hAnsi="Calibri"/>
           <w:color w:val="0F172A"/>
-          <w:sz w:val="21"/>
+          <w:sz w:val="20"/>
         </w:rPr>
-        <w:t>Inspiré des applications de navigation GPS modernes (Google Maps, Waze), le moteur analyse l'angle de déviation trigonométrique entre deux segments consécutifs du chemin calculé par Dijkstra :</w:t>
+        <w:t>Pour guider l'utilisateur comme un véritable GPS indoor, le système calcule l'angle de déviation trigonométrique entre deux segments consécutifs du chemin :</w:t>
       </w:r>
     </w:p>
     <w:p>
@@ -1418,223 +1431,116 @@
         <w:rPr>
           <w:rFonts w:ascii="Calibri" w:hAnsi="Calibri"/>
           <w:color w:val="0F172A"/>
-          <w:sz w:val="21"/>
+          <w:sz w:val="20"/>
         </w:rPr>
-        <w:t>Pour trois nœuds successifs Pi-1, Pi et Pi+1, on calcule les caps θ1 et θ2 via la fonction arc-tangente à deux variables atan2(Δy, Δx). La variation angulaire relative Δθ détermine l'instruction :</w:t>
+        <w:t>Pour trois nœuds successifs P1(x1, y1), P2(x2, y2) et P3(x3, y3), l'angle de direction entrant theta1 et sortant theta2 sont obtenus par atan2(dy, dx). La différence angulaire relative dTheta détermine l'instruction :</w:t>
       </w:r>
     </w:p>
     <w:p>
       <w:pPr>
         <w:pStyle w:val="ListBullet"/>
-        <w:spacing w:after="60" w:line="276" w:lineRule="auto"/>
+        <w:spacing w:after="50" w:line="276" w:lineRule="auto"/>
       </w:pPr>
       <w:r>
         <w:rPr>
           <w:rFonts w:ascii="Calibri" w:hAnsi="Calibri"/>
           <w:b/>
           <w:color w:val="0F172A"/>
-          <w:sz w:val="20"/>
+          <w:sz w:val="19"/>
         </w:rPr>
-        <w:t xml:space="preserve">• Ligne droite : </w:t>
+        <w:t xml:space="preserve">• Si |Δθ| ≤ 25° : </w:t>
       </w:r>
       <w:r>
         <w:rPr>
           <w:rFonts w:ascii="Calibri" w:hAnsi="Calibri"/>
           <w:color w:val="0F172A"/>
-          <w:sz w:val="20"/>
+          <w:sz w:val="19"/>
         </w:rPr>
-        <w:t>Si |Δθ| ≤ 25° : instruction '⬆️ Continuer tout droit sur X m'.</w:t>
+        <w:t>Instruction '⬆️ Continuer tout droit dans le couloir sur X m'.</w:t>
       </w:r>
     </w:p>
     <w:p>
       <w:pPr>
         <w:pStyle w:val="ListBullet"/>
-        <w:spacing w:after="60" w:line="276" w:lineRule="auto"/>
+        <w:spacing w:after="50" w:line="276" w:lineRule="auto"/>
       </w:pPr>
       <w:r>
         <w:rPr>
           <w:rFonts w:ascii="Calibri" w:hAnsi="Calibri"/>
           <w:b/>
           <w:color w:val="0F172A"/>
-          <w:sz w:val="20"/>
+          <w:sz w:val="19"/>
         </w:rPr>
-        <w:t xml:space="preserve">• Virage à gauche : </w:t>
+        <w:t xml:space="preserve">• Si +25° &lt; Δθ ≤ +160° : </w:t>
       </w:r>
       <w:r>
         <w:rPr>
           <w:rFonts w:ascii="Calibri" w:hAnsi="Calibri"/>
           <w:color w:val="0F172A"/>
-          <w:sz w:val="20"/>
+          <w:sz w:val="19"/>
         </w:rPr>
-        <w:t>Si 25° &lt; Δθ ≤ 160° : instruction '↰ Tourner à gauche dans le couloir'.</w:t>
+        <w:t>Instruction '↰ Tourner à gauche dans le couloir'.</w:t>
       </w:r>
     </w:p>
     <w:p>
       <w:pPr>
         <w:pStyle w:val="ListBullet"/>
-        <w:spacing w:after="60" w:line="276" w:lineRule="auto"/>
+        <w:spacing w:after="50" w:line="276" w:lineRule="auto"/>
       </w:pPr>
       <w:r>
         <w:rPr>
           <w:rFonts w:ascii="Calibri" w:hAnsi="Calibri"/>
           <w:b/>
           <w:color w:val="0F172A"/>
-          <w:sz w:val="20"/>
+          <w:sz w:val="19"/>
         </w:rPr>
-        <w:t xml:space="preserve">• Virage à droite : </w:t>
+        <w:t xml:space="preserve">• Si -160° ≤ Δθ &lt; -25° : </w:t>
       </w:r>
       <w:r>
         <w:rPr>
           <w:rFonts w:ascii="Calibri" w:hAnsi="Calibri"/>
           <w:color w:val="0F172A"/>
-          <w:sz w:val="20"/>
+          <w:sz w:val="19"/>
         </w:rPr>
-        <w:t>Si -160° ≤ Δθ &lt; -25° : instruction '↱ Tourner à droite dans le couloir'.</w:t>
+        <w:t>Instruction '↱ Tourner à droite dans le couloir'.</w:t>
       </w:r>
     </w:p>
     <w:p>
       <w:pPr>
         <w:pStyle w:val="ListBullet"/>
-        <w:spacing w:after="60" w:line="276" w:lineRule="auto"/>
+        <w:spacing w:after="50" w:line="276" w:lineRule="auto"/>
       </w:pPr>
       <w:r>
         <w:rPr>
           <w:rFonts w:ascii="Calibri" w:hAnsi="Calibri"/>
           <w:b/>
           <w:color w:val="0F172A"/>
-          <w:sz w:val="20"/>
+          <w:sz w:val="19"/>
         </w:rPr>
-        <w:t xml:space="preserve">• Arrivée : </w:t>
+        <w:t xml:space="preserve">• Dernier segment : </w:t>
       </w:r>
       <w:r>
         <w:rPr>
           <w:rFonts w:ascii="Calibri" w:hAnsi="Calibri"/>
           <w:color w:val="0F172A"/>
-          <w:sz w:val="20"/>
+          <w:sz w:val="19"/>
         </w:rPr>
-        <w:t>Indication de l'arrivée devant la porte de la salle sélectionnée.</w:t>
+        <w:t>Instruction '🎯 Vous êtes arrivé devant la salle'.</w:t>
       </w:r>
     </w:p>
     <w:p>
       <w:pPr>
         <w:keepNext/>
-        <w:spacing w:before="360" w:after="120"/>
+        <w:spacing w:before="320" w:after="120"/>
       </w:pPr>
       <w:r>
         <w:rPr>
           <w:rFonts w:ascii="Calibri" w:hAnsi="Calibri"/>
           <w:b/>
           <w:color w:val="2563EB"/>
-          <w:sz w:val="32"/>
+          <w:sz w:val="30"/>
         </w:rPr>
-        <w:t>7. Améliorations Ergonomiques &amp; Interface Utilisateur</w:t>
-      </w:r>
-    </w:p>
-    <w:p>
-      <w:pPr>
-        <w:pStyle w:val="ListBullet"/>
-        <w:spacing w:after="60" w:line="276" w:lineRule="auto"/>
-      </w:pPr>
-      <w:r>
-        <w:rPr>
-          <w:rFonts w:ascii="Calibri" w:hAnsi="Calibri"/>
-          <w:b/>
-          <w:color w:val="0F172A"/>
-          <w:sz w:val="20"/>
-        </w:rPr>
-        <w:t xml:space="preserve">• En-tête épinglé (Sticky Header) : </w:t>
-      </w:r>
-      <w:r>
-        <w:rPr>
-          <w:rFonts w:ascii="Calibri" w:hAnsi="Calibri"/>
-          <w:color w:val="0F172A"/>
-          <w:sz w:val="20"/>
-        </w:rPr>
-        <w:t>La barre de recherche et les boutons de filtrage sont fixés en haut de la barre latérale. Ils restent toujours accessibles et ne sont plus jamais masqués par la photo de la salle.</w:t>
-      </w:r>
-    </w:p>
-    <w:p>
-      <w:pPr>
-        <w:pStyle w:val="ListBullet"/>
-        <w:spacing w:after="60" w:line="276" w:lineRule="auto"/>
-      </w:pPr>
-      <w:r>
-        <w:rPr>
-          <w:rFonts w:ascii="Calibri" w:hAnsi="Calibri"/>
-          <w:b/>
-          <w:color w:val="0F172A"/>
-          <w:sz w:val="20"/>
-        </w:rPr>
-        <w:t xml:space="preserve">• Fiche détaillée pliable : </w:t>
-      </w:r>
-      <w:r>
-        <w:rPr>
-          <w:rFonts w:ascii="Calibri" w:hAnsi="Calibri"/>
-          <w:color w:val="0F172A"/>
-          <w:sz w:val="20"/>
-        </w:rPr>
-        <w:t>Photo compacte (130px) avec zoom en plein écran au clic. Bouton '✕ Fermer la fiche' permettant de revenir facilement à la liste complète.</w:t>
-      </w:r>
-    </w:p>
-    <w:p>
-      <w:pPr>
-        <w:pStyle w:val="ListBullet"/>
-        <w:spacing w:after="60" w:line="276" w:lineRule="auto"/>
-      </w:pPr>
-      <w:r>
-        <w:rPr>
-          <w:rFonts w:ascii="Calibri" w:hAnsi="Calibri"/>
-          <w:b/>
-          <w:color w:val="0F172A"/>
-          <w:sz w:val="20"/>
-        </w:rPr>
-        <w:t xml:space="preserve">• Nouveau logo officiel : </w:t>
-      </w:r>
-      <w:r>
-        <w:rPr>
-          <w:rFonts w:ascii="Calibri" w:hAnsi="Calibri"/>
-          <w:color w:val="0F172A"/>
-          <w:sz w:val="20"/>
-        </w:rPr>
-        <w:t>Intégration du logo officiel ensIIE en haute définition sur badge blanc, garantissant un contraste parfait sur le thème sombre.</w:t>
-      </w:r>
-    </w:p>
-    <w:p>
-      <w:pPr>
-        <w:pStyle w:val="ListBullet"/>
-        <w:spacing w:after="60" w:line="276" w:lineRule="auto"/>
-      </w:pPr>
-      <w:r>
-        <w:rPr>
-          <w:rFonts w:ascii="Calibri" w:hAnsi="Calibri"/>
-          <w:b/>
-          <w:color w:val="0F172A"/>
-          <w:sz w:val="20"/>
-        </w:rPr>
-        <w:t xml:space="preserve">• Action en un clic : </w:t>
-      </w:r>
-      <w:r>
-        <w:rPr>
-          <w:rFonts w:ascii="Calibri" w:hAnsi="Calibri"/>
-          <w:color w:val="0F172A"/>
-          <w:sz w:val="20"/>
-        </w:rPr>
-        <w:t>Bouton d'accès rapide '📍 Y aller depuis l'entrée' directement sur la fiche d'une salle.</w:t>
-      </w:r>
-    </w:p>
-    <w:p>
-      <w:pPr>
-        <w:keepNext/>
-        <w:spacing w:before="360" w:after="120"/>
-      </w:pPr>
-      <w:r>
-        <w:rPr>
-          <w:rFonts w:ascii="Calibri" w:hAnsi="Calibri"/>
-          <w:b/>
-          <w:color w:val="2563EB"/>
-          <w:sz w:val="32"/>
-        </w:rPr>
-        <w:t>8. Déploiement &amp; Dépôt GitHub</w:t>
+        <w:t>7. Prise en Compte de l'Accessibilité PMR</w:t>
       </w:r>
     </w:p>
     <w:p>
@@ -1645,31 +1551,177 @@
         <w:rPr>
           <w:rFonts w:ascii="Calibri" w:hAnsi="Calibri"/>
           <w:color w:val="0F172A"/>
-          <w:sz w:val="21"/>
+          <w:sz w:val="20"/>
         </w:rPr>
-        <w:t>L'ensemble du code source propre, documenté et testé a été synchronisé avec succès sur le dépôt GitHub de l'équipe :</w:t>
+        <w:t>L'étage R+1 comporte un ascenseur et des escaliers. L'application propose un commutateur PMR :</w:t>
       </w:r>
     </w:p>
     <w:p>
       <w:pPr>
-        <w:spacing w:after="80" w:line="276" w:lineRule="auto"/>
+        <w:pStyle w:val="ListBullet"/>
+        <w:spacing w:after="50" w:line="276" w:lineRule="auto"/>
       </w:pPr>
       <w:r>
         <w:rPr>
           <w:rFonts w:ascii="Calibri" w:hAnsi="Calibri"/>
           <w:b/>
           <w:color w:val="0F172A"/>
-          <w:sz w:val="21"/>
+          <w:sz w:val="19"/>
         </w:rPr>
-        <w:t xml:space="preserve">Dépôt officiel : </w:t>
+        <w:t xml:space="preserve">• Réorientation automatique : </w:t>
       </w:r>
       <w:r>
         <w:rPr>
           <w:rFonts w:ascii="Calibri" w:hAnsi="Calibri"/>
           <w:color w:val="0F172A"/>
-          <w:sz w:val="21"/>
+          <w:sz w:val="19"/>
         </w:rPr>
-        <w:t>https://github.com/Agathe-lcn/Jumeau-numerique</w:t>
+        <w:t>Le point de départ par défaut bascule automatiquement des escaliers vers l'ascenseur central.</w:t>
+      </w:r>
+    </w:p>
+    <w:p>
+      <w:pPr>
+        <w:pStyle w:val="ListBullet"/>
+        <w:spacing w:after="50" w:line="276" w:lineRule="auto"/>
+      </w:pPr>
+      <w:r>
+        <w:rPr>
+          <w:rFonts w:ascii="Calibri" w:hAnsi="Calibri"/>
+          <w:b/>
+          <w:color w:val="0F172A"/>
+          <w:sz w:val="19"/>
+        </w:rPr>
+        <w:t xml:space="preserve">• Confort d'accès : </w:t>
+      </w:r>
+      <w:r>
+        <w:rPr>
+          <w:rFonts w:ascii="Calibri" w:hAnsi="Calibri"/>
+          <w:color w:val="0F172A"/>
+          <w:sz w:val="19"/>
+        </w:rPr>
+        <w:t>Tous les chemins calculés empruntent des couloirs de largeur réglementaire (&gt; 1,40 m) sans marche ni obstacle.</w:t>
+      </w:r>
+    </w:p>
+    <w:p>
+      <w:pPr>
+        <w:keepNext/>
+        <w:spacing w:before="320" w:after="120"/>
+      </w:pPr>
+      <w:r>
+        <w:rPr>
+          <w:rFonts w:ascii="Calibri" w:hAnsi="Calibri"/>
+          <w:b/>
+          <w:color w:val="2563EB"/>
+          <w:sz w:val="30"/>
+        </w:rPr>
+        <w:t>8. Améliorations Ergonomiques Réalisées</w:t>
+      </w:r>
+    </w:p>
+    <w:p>
+      <w:pPr>
+        <w:pStyle w:val="ListBullet"/>
+        <w:spacing w:after="50" w:line="276" w:lineRule="auto"/>
+      </w:pPr>
+      <w:r>
+        <w:rPr>
+          <w:rFonts w:ascii="Calibri" w:hAnsi="Calibri"/>
+          <w:b/>
+          <w:color w:val="0F172A"/>
+          <w:sz w:val="19"/>
+        </w:rPr>
+        <w:t xml:space="preserve">• En-tête épinglé (Sticky Header) : </w:t>
+      </w:r>
+      <w:r>
+        <w:rPr>
+          <w:rFonts w:ascii="Calibri" w:hAnsi="Calibri"/>
+          <w:color w:val="0F172A"/>
+          <w:sz w:val="19"/>
+        </w:rPr>
+        <w:t>La zone de recherche et les boutons de filtrage sont fixés en haut de la barre latérale. Ils restent toujours accessibles même lors du défilement.</w:t>
+      </w:r>
+    </w:p>
+    <w:p>
+      <w:pPr>
+        <w:pStyle w:val="ListBullet"/>
+        <w:spacing w:after="50" w:line="276" w:lineRule="auto"/>
+      </w:pPr>
+      <w:r>
+        <w:rPr>
+          <w:rFonts w:ascii="Calibri" w:hAnsi="Calibri"/>
+          <w:b/>
+          <w:color w:val="0F172A"/>
+          <w:sz w:val="19"/>
+        </w:rPr>
+        <w:t xml:space="preserve">• Fiche pliable : </w:t>
+      </w:r>
+      <w:r>
+        <w:rPr>
+          <w:rFonts w:ascii="Calibri" w:hAnsi="Calibri"/>
+          <w:color w:val="0F172A"/>
+          <w:sz w:val="19"/>
+        </w:rPr>
+        <w:t>Les photos des salles sont intégrées dans un format compact (130 px) avec zoom plein écran au clic. Un bouton '✕ Fermer' permet de masquer la photo à tout moment.</w:t>
+      </w:r>
+    </w:p>
+    <w:p>
+      <w:pPr>
+        <w:pStyle w:val="ListBullet"/>
+        <w:spacing w:after="50" w:line="276" w:lineRule="auto"/>
+      </w:pPr>
+      <w:r>
+        <w:rPr>
+          <w:rFonts w:ascii="Calibri" w:hAnsi="Calibri"/>
+          <w:b/>
+          <w:color w:val="0F172A"/>
+          <w:sz w:val="19"/>
+        </w:rPr>
+        <w:t xml:space="preserve">• Nouveau logo officiel : </w:t>
+      </w:r>
+      <w:r>
+        <w:rPr>
+          <w:rFonts w:ascii="Calibri" w:hAnsi="Calibri"/>
+          <w:color w:val="0F172A"/>
+          <w:sz w:val="19"/>
+        </w:rPr>
+        <w:t>Intégration du logo ensIIE officiel en haute définition sur fond badge blanc, assurant un rendu parfait sur le thème sombre.</w:t>
+      </w:r>
+    </w:p>
+    <w:p>
+      <w:pPr>
+        <w:pStyle w:val="ListBullet"/>
+        <w:spacing w:after="50" w:line="276" w:lineRule="auto"/>
+      </w:pPr>
+      <w:r>
+        <w:rPr>
+          <w:rFonts w:ascii="Calibri" w:hAnsi="Calibri"/>
+          <w:b/>
+          <w:color w:val="0F172A"/>
+          <w:sz w:val="19"/>
+        </w:rPr>
+        <w:t xml:space="preserve">• Raccourci rapide : </w:t>
+      </w:r>
+      <w:r>
+        <w:rPr>
+          <w:rFonts w:ascii="Calibri" w:hAnsi="Calibri"/>
+          <w:color w:val="0F172A"/>
+          <w:sz w:val="19"/>
+        </w:rPr>
+        <w:t>Bouton d'action directe '📍 Y aller depuis l'entrée' sur chaque fiche de salle.</w:t>
+      </w:r>
+    </w:p>
+    <w:p>
+      <w:pPr>
+        <w:keepNext/>
+        <w:spacing w:before="320" w:after="120"/>
+      </w:pPr>
+      <w:r>
+        <w:rPr>
+          <w:rFonts w:ascii="Calibri" w:hAnsi="Calibri"/>
+          <w:b/>
+          <w:color w:val="2563EB"/>
+          <w:sz w:val="30"/>
+        </w:rPr>
+        <w:t>9. Guide de Démarrage &amp; Présentation pour le Hackathon</w:t>
       </w:r>
     </w:p>
     <w:p>
@@ -1680,78 +1732,91 @@
         <w:rPr>
           <w:rFonts w:ascii="Calibri" w:hAnsi="Calibri"/>
           <w:color w:val="0F172A"/>
-          <w:sz w:val="21"/>
+          <w:sz w:val="20"/>
         </w:rPr>
-        <w:t>Pour lancer l'application en local :</w:t>
+        <w:t>Pour lancer la plateforme lors de la démonstration devant le jury :</w:t>
       </w:r>
     </w:p>
     <w:p>
       <w:pPr>
         <w:pStyle w:val="ListBullet"/>
-        <w:spacing w:after="60" w:line="276" w:lineRule="auto"/>
+        <w:spacing w:after="50" w:line="276" w:lineRule="auto"/>
       </w:pPr>
       <w:r>
         <w:rPr>
           <w:rFonts w:ascii="Calibri" w:hAnsi="Calibri"/>
           <w:b/>
           <w:color w:val="0F172A"/>
-          <w:sz w:val="20"/>
+          <w:sz w:val="19"/>
         </w:rPr>
-        <w:t xml:space="preserve">Étape 1 : </w:t>
+        <w:t xml:space="preserve">1. Lancement du serveur : </w:t>
       </w:r>
+      <w:r>
+        <w:rPr>
+          <w:rFonts w:ascii="Calibri" w:hAnsi="Calibri"/>
+          <w:color w:val="0F172A"/>
+          <w:sz w:val="19"/>
+        </w:rPr>
+        <w:t>Ouvrir le terminal dans le dossier du projet.</w:t>
+      </w:r>
+    </w:p>
+    <w:p>
+      <w:pPr>
+        <w:pStyle w:val="ListBullet"/>
+        <w:spacing w:after="50" w:line="276" w:lineRule="auto"/>
+      </w:pPr>
+      <w:r>
+        <w:rPr>
+          <w:rFonts w:ascii="Calibri" w:hAnsi="Calibri"/>
+          <w:b/>
+          <w:color w:val="0F172A"/>
+          <w:sz w:val="19"/>
+        </w:rPr>
+        <w:t xml:space="preserve">2. Commande : </w:t>
+      </w:r>
+      <w:r>
+        <w:rPr>
+          <w:rFonts w:ascii="Calibri" w:hAnsi="Calibri"/>
+          <w:color w:val="0F172A"/>
+          <w:sz w:val="19"/>
+        </w:rPr>
+        <w:t>python -m http.server 8080</w:t>
+      </w:r>
+    </w:p>
+    <w:p>
+      <w:pPr>
+        <w:pStyle w:val="ListBullet"/>
+        <w:spacing w:after="50" w:line="276" w:lineRule="auto"/>
+      </w:pPr>
+      <w:r>
+        <w:rPr>
+          <w:rFonts w:ascii="Calibri" w:hAnsi="Calibri"/>
+          <w:b/>
+          <w:color w:val="0F172A"/>
+          <w:sz w:val="19"/>
+        </w:rPr>
+        <w:t xml:space="preserve">3. Accès navigateur : </w:t>
+      </w:r>
+      <w:r>
+        <w:rPr>
+          <w:rFonts w:ascii="Calibri" w:hAnsi="Calibri"/>
+          <w:color w:val="0F172A"/>
+          <w:sz w:val="19"/>
+        </w:rPr>
+        <w:t>Ouvrir Google Chrome à l'adresse http://localhost:8080</w:t>
+      </w:r>
+    </w:p>
+    <w:p>
+      <w:pPr>
+        <w:spacing w:after="80" w:line="276" w:lineRule="auto"/>
+      </w:pPr>
       <w:r>
         <w:rPr>
           <w:rFonts w:ascii="Calibri" w:hAnsi="Calibri"/>
           <w:color w:val="0F172A"/>
           <w:sz w:val="20"/>
         </w:rPr>
-        <w:t>Ouvrir un terminal dans le dossier du projet.</w:t>
-      </w:r>
-    </w:p>
-    <w:p>
-      <w:pPr>
-        <w:pStyle w:val="ListBullet"/>
-        <w:spacing w:after="60" w:line="276" w:lineRule="auto"/>
-      </w:pPr>
-      <w:r>
-        <w:rPr>
-          <w:rFonts w:ascii="Calibri" w:hAnsi="Calibri"/>
-          <w:b/>
-          <w:color w:val="0F172A"/>
-          <w:sz w:val="20"/>
-        </w:rPr>
-        <w:t xml:space="preserve">Étape 2 : </w:t>
-      </w:r>
-      <w:r>
-        <w:rPr>
-          <w:rFonts w:ascii="Calibri" w:hAnsi="Calibri"/>
-          <w:color w:val="0F172A"/>
-          <w:sz w:val="20"/>
-        </w:rPr>
-        <w:t>Exécuter : python -m http.server 8080</w:t>
-      </w:r>
-    </w:p>
-    <w:p>
-      <w:pPr>
-        <w:pStyle w:val="ListBullet"/>
-        <w:spacing w:after="60" w:line="276" w:lineRule="auto"/>
-      </w:pPr>
-      <w:r>
-        <w:rPr>
-          <w:rFonts w:ascii="Calibri" w:hAnsi="Calibri"/>
-          <w:b/>
-          <w:color w:val="0F172A"/>
-          <w:sz w:val="20"/>
-        </w:rPr>
-        <w:t xml:space="preserve">Étape 3 : </w:t>
-      </w:r>
-      <w:r>
-        <w:rPr>
-          <w:rFonts w:ascii="Calibri" w:hAnsi="Calibri"/>
-          <w:color w:val="0F172A"/>
-          <w:sz w:val="20"/>
-        </w:rPr>
-        <w:t>Ouvrir dans Google Chrome : http://localhost:8080</w:t>
+        <w:t>Dépôt GitHub officiel : https://github.com/Agathe-lcn/Jumeau-numerique (Branche main synchronisée).</w:t>
       </w:r>
     </w:p>
     <w:sectPr>

</xml_diff>